<commit_message>
Integrate HCC recapture into audit-cycle pass (Phase 2)
Previously the workflow treated HCC recapture as a Phase 4 add-on
performed as a separate pass through the same charts. Reworked so the
auditor logs HCC findings during the same chart read as the
documentation audit.

Changes:
- Phase 1 step 4: pull prior-year HCC lists as part of foundation
  setup, not later.
- Phase 2 renamed 'First audit + HCC'. Now 6 steps (6-11) explicitly
  covering: open both workbooks side-by-side, audit + log HCCs in one
  pass, scorecard includes both compliance + HCC feedback.
- Phase 4 becomes 'Add HEDIS + expand' - HCC is no longer new work
  here, just refresh + query follow-up. New steps focus on adding
  HEDIS/CPT II gap review and deciding whether to expand rotation.
- Phase 5 steps renumbered 21-25.
- Master checklist rewritten to reflect the integrated workflow.

Co-Authored-By: Claude Opus 4.7 <noreply@anthropic.com>
Claude-Session: https://claude.ai/code/session_01FQCsD1ZdbqSqbtLgYtoLBe
</commit_message>
<xml_diff>
--- a/docs/Coding_CDI_Startup_Workflow.docx
+++ b/docs/Coding_CDI_Startup_Workflow.docx
@@ -271,7 +271,7 @@
           </w:tcPr>
           <w:p>
             <w:r>
-              <w:t>Get the sponsor, scope, and tools ready.</w:t>
+              <w:t>Get the sponsor, scope, and tools ready · pull HCC lists.</w:t>
             </w:r>
           </w:p>
         </w:tc>
@@ -281,7 +281,7 @@
           </w:tcPr>
           <w:p>
             <w:r>
-              <w:t>Signed scope agreement · tools in place.</w:t>
+              <w:t>Signed scope agreement · payer HCC lists · tools in place.</w:t>
             </w:r>
           </w:p>
         </w:tc>
@@ -294,7 +294,7 @@
           </w:tcPr>
           <w:p>
             <w:r>
-              <w:t>2 · First audit</w:t>
+              <w:t>2 · First audit + HCC</w:t>
             </w:r>
           </w:p>
         </w:tc>
@@ -316,7 +316,7 @@
           </w:tcPr>
           <w:p>
             <w:r>
-              <w:t>Pick 3 providers · run the first audit cycle.</w:t>
+              <w:t>Pick 3 providers · audit charts AND log HCC recaptures in the same pass.</w:t>
             </w:r>
           </w:p>
         </w:tc>
@@ -327,7 +327,7 @@
           </w:tcPr>
           <w:p>
             <w:r>
-              <w:t>Baseline compliance scores · first scorecards.</w:t>
+              <w:t>Baseline compliance scores · first scorecards · first HCC recaptures.</w:t>
             </w:r>
           </w:p>
         </w:tc>
@@ -359,7 +359,7 @@
           </w:tcPr>
           <w:p>
             <w:r>
-              <w:t>Turn the first cycle into a repeatable process.</w:t>
+              <w:t>Turn the first cycle into a repeatable process · first education tip.</w:t>
             </w:r>
           </w:p>
         </w:tc>
@@ -369,7 +369,7 @@
           </w:tcPr>
           <w:p>
             <w:r>
-              <w:t>Monthly SOP · first education tip.</w:t>
+              <w:t>Monthly SOP · Provider Education Tip #1.</w:t>
             </w:r>
           </w:p>
         </w:tc>
@@ -382,7 +382,7 @@
           </w:tcPr>
           <w:p>
             <w:r>
-              <w:t>4 · Prove value</w:t>
+              <w:t>4 · Add HEDIS + expand</w:t>
             </w:r>
           </w:p>
         </w:tc>
@@ -404,7 +404,7 @@
           </w:tcPr>
           <w:p>
             <w:r>
-              <w:t>Add HCC + HEDIS layers · start showing wins.</w:t>
+              <w:t>Layer HEDIS/CPT II gap review · consider adding a 4th–5th provider.</w:t>
             </w:r>
           </w:p>
         </w:tc>
@@ -415,7 +415,7 @@
           </w:tcPr>
           <w:p>
             <w:r>
-              <w:t>First HCC recaptures · first quality gap closures.</w:t>
+              <w:t>HEDIS gap list · expanded provider rotation.</w:t>
             </w:r>
           </w:p>
         </w:tc>
@@ -806,7 +806,7 @@
                 <w:color w:val="0F172A"/>
                 <w:sz w:val="22"/>
               </w:rPr>
-              <w:t>Request access to payer portals for MA/HCC lists (Humana, Aetna, Anthem, whichever plans your patients are on).</w:t>
+              <w:t>Request access to payer portals and pull the prior-year HCC list for the MA/risk-adjusted patients of your first 3 providers. Print or export.</w:t>
             </w:r>
           </w:p>
           <w:p>
@@ -826,7 +826,7 @@
                 <w:color w:val="0F172A"/>
                 <w:sz w:val="19"/>
               </w:rPr>
-              <w:t>Login credentials for at least one payer portal.</w:t>
+              <w:t>Prior-year HCC list per patient · ready alongside the audit workbook.</w:t>
             </w:r>
           </w:p>
           <w:p>
@@ -847,7 +847,7 @@
                 <w:color w:val="555555"/>
                 <w:sz w:val="19"/>
               </w:rPr>
-              <w:t>Payer portals are the source of prior-year HCC lists — free intelligence.</w:t>
+              <w:t>You need this BEFORE Phase 2 so you can recapture HCCs in the same pass as the audit.</w:t>
             </w:r>
           </w:p>
         </w:tc>
@@ -956,12 +956,12 @@
           <w:color w:val="0F6E6E"/>
           <w:sz w:val="32"/>
         </w:rPr>
-        <w:t>Phase 2 · First audit cycle  (days 8–21)</w:t>
+        <w:t>Phase 2 · First audit cycle + HCC recapture  (days 8–21)</w:t>
       </w:r>
     </w:p>
     <w:p>
       <w:r>
-        <w:t>Run the tool for real. This produces your first data — the baseline every future improvement gets measured against.</w:t>
+        <w:t>Run the tool for real — and capture HCCs at the same time. Since you're already reading every chart end-to-end for the documentation audit, layer the HCC check into the same pass. One read of the chart, two workflows completed. Don't do them as separate cycles.</w:t>
       </w:r>
     </w:p>
     <w:tbl>
@@ -1103,7 +1103,7 @@
                 <w:color w:val="0F172A"/>
                 <w:sz w:val="22"/>
               </w:rPr>
-              <w:t>Audit each chart on its Claim tab (Claim 01–10 for provider 1 · save-as archive · reset and repeat for providers 2 and 3).</w:t>
+              <w:t>Open the audit workbook AND the HCC Recapture Tracker side by side. Also open the patient's prior-year HCC list (from Phase 1) for MA patients.</w:t>
             </w:r>
           </w:p>
           <w:p>
@@ -1123,7 +1123,7 @@
                 <w:color w:val="0F172A"/>
                 <w:sz w:val="19"/>
               </w:rPr>
-              <w:t>30 completed Claim tabs · 30 rows on the Audit Log.</w:t>
+              <w:t>Both workbooks open · HCC list visible while auditing.</w:t>
             </w:r>
           </w:p>
           <w:p>
@@ -1144,7 +1144,7 @@
                 <w:color w:val="555555"/>
                 <w:sz w:val="19"/>
               </w:rPr>
-              <w:t>Aim for ~2 hours per provider. Don't get precious on the first cycle · consistency beats perfection.</w:t>
+              <w:t>This is the key setup that lets you audit + recapture in one pass.</w:t>
             </w:r>
           </w:p>
         </w:tc>
@@ -1196,7 +1196,7 @@
                 <w:color w:val="0F172A"/>
                 <w:sz w:val="22"/>
               </w:rPr>
-              <w:t>Review the Provider Metrics tab for each provider to get their monthly compliance % and band.</w:t>
+              <w:t>For each chart: audit the 16 documentation elements on the Claim tab AND log any HCC finding on the HCC Recapture Tracker at the same time. Categorize each HCC as Prior-Year (recaptured or missed), Suspect, or New.</w:t>
             </w:r>
           </w:p>
           <w:p>
@@ -1216,7 +1216,7 @@
                 <w:color w:val="0F172A"/>
                 <w:sz w:val="19"/>
               </w:rPr>
-              <w:t>3 provider scorecards with baseline data.</w:t>
+              <w:t>30 completed Claim tabs · HCC Log rows for every HCC found or missed on those charts.</w:t>
             </w:r>
           </w:p>
           <w:p>
@@ -1237,7 +1237,7 @@
                 <w:color w:val="555555"/>
                 <w:sz w:val="19"/>
               </w:rPr>
-              <w:t>This is your first real data point · every future improvement gets measured against it.</w:t>
+              <w:t>One chart read = one audit row + one or more HCC log rows. Save the second pass through the chart later in the month for cases that need a query response.</w:t>
             </w:r>
           </w:p>
         </w:tc>
@@ -1289,7 +1289,7 @@
                 <w:color w:val="0F172A"/>
                 <w:sz w:val="22"/>
               </w:rPr>
-              <w:t>Draft a one-page scorecard email for each provider: their compliance %, top 2 deficiencies, one specific documentation tip.</w:t>
+              <w:t>Review the Provider Metrics tab for compliance % AND the HCC Recapture Tracker's Monthly Summary for recapture rate + RAF impact.</w:t>
             </w:r>
           </w:p>
           <w:p>
@@ -1309,7 +1309,7 @@
                 <w:color w:val="0F172A"/>
                 <w:sz w:val="19"/>
               </w:rPr>
-              <w:t>3 scorecard emails ready to send.</w:t>
+              <w:t>3 provider scorecards with BOTH baseline compliance data and HCC recapture data.</w:t>
             </w:r>
           </w:p>
           <w:p>
@@ -1330,7 +1330,7 @@
                 <w:color w:val="555555"/>
                 <w:sz w:val="19"/>
               </w:rPr>
-              <w:t>Positive tone. Focus on one specific improvement, not a laundry list.</w:t>
+              <w:t>Two data points per provider from day one · double the story for leadership.</w:t>
             </w:r>
           </w:p>
         </w:tc>
@@ -1364,6 +1364,99 @@
                 <w:sz w:val="28"/>
               </w:rPr>
               <w:t>10</w:t>
+            </w:r>
+          </w:p>
+        </w:tc>
+        <w:tc>
+          <w:tcPr>
+            <w:tcW w:type="dxa" w:w="8496"/>
+            <w:vAlign w:val="center"/>
+          </w:tcPr>
+          <w:p>
+            <w:pPr>
+              <w:spacing w:after="40"/>
+            </w:pPr>
+            <w:r>
+              <w:rPr>
+                <w:b/>
+                <w:color w:val="0F172A"/>
+                <w:sz w:val="22"/>
+              </w:rPr>
+              <w:t>Draft a one-page scorecard email for each provider: their compliance %, top 2 documentation deficiencies, HCCs recaptured, HCCs missed with suggested capture language, one specific documentation tip.</w:t>
+            </w:r>
+          </w:p>
+          <w:p>
+            <w:pPr>
+              <w:spacing w:after="40"/>
+            </w:pPr>
+            <w:r>
+              <w:rPr>
+                <w:b/>
+                <w:color w:val="0F6E6E"/>
+                <w:sz w:val="19"/>
+              </w:rPr>
+              <w:t xml:space="preserve">Output: </w:t>
+            </w:r>
+            <w:r>
+              <w:rPr>
+                <w:color w:val="0F172A"/>
+                <w:sz w:val="19"/>
+              </w:rPr>
+              <w:t>3 scorecard emails ready to send · integrated documentation + HCC feedback.</w:t>
+            </w:r>
+          </w:p>
+          <w:p>
+            <w:pPr>
+              <w:spacing w:after="40"/>
+            </w:pPr>
+            <w:r>
+              <w:rPr>
+                <w:b/>
+                <w:color w:val="555555"/>
+                <w:sz w:val="19"/>
+              </w:rPr>
+              <w:t xml:space="preserve">Notes: </w:t>
+            </w:r>
+            <w:r>
+              <w:rPr>
+                <w:i/>
+                <w:color w:val="555555"/>
+                <w:sz w:val="19"/>
+              </w:rPr>
+              <w:t>Positive tone. HCC feedback is high-value to providers because it's tied to revenue.</w:t>
+            </w:r>
+          </w:p>
+        </w:tc>
+      </w:tr>
+    </w:tbl>
+    <w:tbl>
+      <w:tblPr>
+        <w:tblW w:type="auto" w:w="0"/>
+        <w:tblLayout w:type="fixed"/>
+        <w:tblLook w:firstColumn="1" w:firstRow="1" w:lastColumn="0" w:lastRow="0" w:noHBand="0" w:noVBand="1" w:val="04A0"/>
+      </w:tblPr>
+      <w:tblGrid>
+        <w:gridCol w:w="4986"/>
+        <w:gridCol w:w="4986"/>
+      </w:tblGrid>
+      <w:tr>
+        <w:tc>
+          <w:tcPr>
+            <w:tcW w:type="dxa" w:w="720"/>
+            <w:shd w:fill="0F6E6E"/>
+            <w:vAlign w:val="center"/>
+          </w:tcPr>
+          <w:p>
+            <w:pPr>
+              <w:jc w:val="center"/>
+            </w:pPr>
+            <w:r>
+              <w:rPr>
+                <w:b/>
+                <w:color w:val="FFFFFF"/>
+                <w:sz w:val="28"/>
+              </w:rPr>
+              <w:t>11</w:t>
             </w:r>
           </w:p>
         </w:tc>
@@ -1474,7 +1567,7 @@
                 <w:color w:val="FFFFFF"/>
                 <w:sz w:val="28"/>
               </w:rPr>
-              <w:t>11</w:t>
+              <w:t>12</w:t>
             </w:r>
           </w:p>
         </w:tc>
@@ -1493,7 +1586,7 @@
                 <w:color w:val="0F172A"/>
                 <w:sz w:val="22"/>
               </w:rPr>
-              <w:t>Write a 1-page monthly SOP: 'Days 1-4 wait, 5-15 audit, 15-20 scorecards, 20-25 HCC review, 25-28 leadership summary.'</w:t>
+              <w:t>Write a 1-page monthly SOP: 'Days 1-4 wait, 5-15 audit + HCC recapture (same pass), 15-20 scorecards, 20-25 queries and follow-up, 25-28 leadership summary.'</w:t>
             </w:r>
           </w:p>
           <w:p>
@@ -1567,7 +1660,7 @@
                 <w:color w:val="FFFFFF"/>
                 <w:sz w:val="28"/>
               </w:rPr>
-              <w:t>12</w:t>
+              <w:t>13</w:t>
             </w:r>
           </w:p>
         </w:tc>
@@ -1586,7 +1679,7 @@
                 <w:color w:val="0F172A"/>
                 <w:sz w:val="22"/>
               </w:rPr>
-              <w:t>Do your second monthly audit cycle exactly the same way. Time yourself. Adjust the SOP based on what actually worked vs. what didn't.</w:t>
+              <w:t>Do your second monthly audit cycle exactly the same way (audit + HCC in one pass). Time yourself. Adjust the SOP based on what actually worked vs. what didn't.</w:t>
             </w:r>
           </w:p>
           <w:p>
@@ -1606,7 +1699,7 @@
                 <w:color w:val="0F172A"/>
                 <w:sz w:val="19"/>
               </w:rPr>
-              <w:t>60 total charts audited (30 baseline + 30 second cycle) · SOP v2.</w:t>
+              <w:t>60 total charts audited (30 baseline + 30 second cycle) · SOP v2 · HCC log now has two months of recapture data.</w:t>
             </w:r>
           </w:p>
           <w:p>
@@ -1660,7 +1753,7 @@
                 <w:color w:val="FFFFFF"/>
                 <w:sz w:val="28"/>
               </w:rPr>
-              <w:t>13</w:t>
+              <w:t>14</w:t>
             </w:r>
           </w:p>
         </w:tc>
@@ -1679,7 +1772,7 @@
                 <w:color w:val="0F172A"/>
                 <w:sz w:val="22"/>
               </w:rPr>
-              <w:t>Produce the first monthly leadership summary email — 5 bullets: charts audited, avg compliance %, providers in each band, top deficiency pattern, next-month focus.</w:t>
+              <w:t>Produce the first monthly leadership summary email — 5 bullets: charts audited, avg compliance %, providers in each band, HCCs recaptured + RAF impact, next-month focus.</w:t>
             </w:r>
           </w:p>
           <w:p>
@@ -1753,7 +1846,7 @@
                 <w:color w:val="FFFFFF"/>
                 <w:sz w:val="28"/>
               </w:rPr>
-              <w:t>14</w:t>
+              <w:t>15</w:t>
             </w:r>
           </w:p>
         </w:tc>
@@ -1829,107 +1922,14 @@
           <w:color w:val="0F6E6E"/>
           <w:sz w:val="32"/>
         </w:rPr>
-        <w:t>Phase 4 · Prove value  (days 46–75)</w:t>
+        <w:t>Phase 4 · Add HEDIS layer + expand  (days 46–75)</w:t>
       </w:r>
     </w:p>
     <w:p>
       <w:r>
-        <w:t>Time to layer HCC and HEDIS on top of the audit rhythm. This is where the department starts generating measurable dollar impact.</w:t>
+        <w:t>Documentation audits and HCC recapture are already running from day one. Now add the HEDIS/CPT II layer and, if bandwidth allows, expand the provider rotation. Cycle 3 is where the department starts looking like a full program instead of a pilot.</w:t>
       </w:r>
     </w:p>
-    <w:tbl>
-      <w:tblPr>
-        <w:tblW w:type="auto" w:w="0"/>
-        <w:tblLayout w:type="fixed"/>
-        <w:tblLook w:firstColumn="1" w:firstRow="1" w:lastColumn="0" w:lastRow="0" w:noHBand="0" w:noVBand="1" w:val="04A0"/>
-      </w:tblPr>
-      <w:tblGrid>
-        <w:gridCol w:w="4986"/>
-        <w:gridCol w:w="4986"/>
-      </w:tblGrid>
-      <w:tr>
-        <w:tc>
-          <w:tcPr>
-            <w:tcW w:type="dxa" w:w="720"/>
-            <w:shd w:fill="0F6E6E"/>
-            <w:vAlign w:val="center"/>
-          </w:tcPr>
-          <w:p>
-            <w:pPr>
-              <w:jc w:val="center"/>
-            </w:pPr>
-            <w:r>
-              <w:rPr>
-                <w:b/>
-                <w:color w:val="FFFFFF"/>
-                <w:sz w:val="28"/>
-              </w:rPr>
-              <w:t>15</w:t>
-            </w:r>
-          </w:p>
-        </w:tc>
-        <w:tc>
-          <w:tcPr>
-            <w:tcW w:type="dxa" w:w="8496"/>
-            <w:vAlign w:val="center"/>
-          </w:tcPr>
-          <w:p>
-            <w:pPr>
-              <w:spacing w:after="40"/>
-            </w:pPr>
-            <w:r>
-              <w:rPr>
-                <w:b/>
-                <w:color w:val="0F172A"/>
-                <w:sz w:val="22"/>
-              </w:rPr>
-              <w:t>Pull the prior-year HCC list from the payer portal for each MA patient of your 3 providers.</w:t>
-            </w:r>
-          </w:p>
-          <w:p>
-            <w:pPr>
-              <w:spacing w:after="40"/>
-            </w:pPr>
-            <w:r>
-              <w:rPr>
-                <w:b/>
-                <w:color w:val="0F6E6E"/>
-                <w:sz w:val="19"/>
-              </w:rPr>
-              <w:t xml:space="preserve">Output: </w:t>
-            </w:r>
-            <w:r>
-              <w:rPr>
-                <w:color w:val="0F172A"/>
-                <w:sz w:val="19"/>
-              </w:rPr>
-              <w:t>MA panel with prior-year HCC report per patient.</w:t>
-            </w:r>
-          </w:p>
-          <w:p>
-            <w:pPr>
-              <w:spacing w:after="40"/>
-            </w:pPr>
-            <w:r>
-              <w:rPr>
-                <w:b/>
-                <w:color w:val="555555"/>
-                <w:sz w:val="19"/>
-              </w:rPr>
-              <w:t xml:space="preserve">Notes: </w:t>
-            </w:r>
-            <w:r>
-              <w:rPr>
-                <w:i/>
-                <w:color w:val="555555"/>
-                <w:sz w:val="19"/>
-              </w:rPr>
-              <w:t>Payers provide these lists for free. Use them.</w:t>
-            </w:r>
-          </w:p>
-        </w:tc>
-      </w:tr>
-    </w:tbl>
     <w:tbl>
       <w:tblPr>
         <w:tblW w:type="auto" w:w="0"/>
@@ -1976,7 +1976,7 @@
                 <w:color w:val="0F172A"/>
                 <w:sz w:val="22"/>
               </w:rPr>
-              <w:t>For every chart you audit in cycle 3, cross-check the note against the patient's prior-year HCC list. Log each recapture and each miss on the HCC Recapture Tracker.</w:t>
+              <w:t>Refresh the prior-year HCC lists for cycle 3 (patient panels evolve · pull the latest).</w:t>
             </w:r>
           </w:p>
           <w:p>
@@ -1996,7 +1996,7 @@
                 <w:color w:val="0F172A"/>
                 <w:sz w:val="19"/>
               </w:rPr>
-              <w:t>HCC Log populated · monthly summary shows recapture rate + RAF impact.</w:t>
+              <w:t>Updated HCC lists ready for cycle 3 audit + recapture pass.</w:t>
             </w:r>
           </w:p>
           <w:p>
@@ -2017,7 +2017,7 @@
                 <w:color w:val="555555"/>
                 <w:sz w:val="19"/>
               </w:rPr>
-              <w:t>Every recapture is dollars back into the system. Track them.</w:t>
+              <w:t>Same integrated workflow · audit + HCC together in one chart read.</w:t>
             </w:r>
           </w:p>
         </w:tc>
@@ -2069,7 +2069,7 @@
                 <w:color w:val="0F172A"/>
                 <w:sz w:val="22"/>
               </w:rPr>
-              <w:t>Send provider queries for any HCC that appears to apply but was not documented (suspect conditions).</w:t>
+              <w:t>Send provider queries for any suspect HCCs surfaced across cycles 1 and 2 that still need documentation. Track responses on the HCC Log.</w:t>
             </w:r>
           </w:p>
           <w:p>
@@ -2089,7 +2089,7 @@
                 <w:color w:val="0F172A"/>
                 <w:sz w:val="19"/>
               </w:rPr>
-              <w:t>Query log · provider responses tracked in HCC Log.</w:t>
+              <w:t>Query log · provider responses tracked · recapture rate improves.</w:t>
             </w:r>
           </w:p>
           <w:p>
@@ -2182,7 +2182,7 @@
                 <w:color w:val="0F172A"/>
                 <w:sz w:val="19"/>
               </w:rPr>
-              <w:t>Gap list handed to the billing team.</w:t>
+              <w:t>Gap list handed to the billing team · monthly HEDIS routine established.</w:t>
             </w:r>
           </w:p>
           <w:p>
@@ -2255,7 +2255,100 @@
                 <w:color w:val="0F172A"/>
                 <w:sz w:val="22"/>
               </w:rPr>
-              <w:t>Update the KPI Tracker Monthly Data tab with your first 3 months of data: providers on rotation, charts audited, avg compliance %, HCCs recaptured, etc.</w:t>
+              <w:t>Decide whether to add a 4th or 5th provider to the audit rotation. If cycles 1-2 fit within your week comfortably, expand. Otherwise stay at 3.</w:t>
+            </w:r>
+          </w:p>
+          <w:p>
+            <w:pPr>
+              <w:spacing w:after="40"/>
+            </w:pPr>
+            <w:r>
+              <w:rPr>
+                <w:b/>
+                <w:color w:val="0F6E6E"/>
+                <w:sz w:val="19"/>
+              </w:rPr>
+              <w:t xml:space="preserve">Output: </w:t>
+            </w:r>
+            <w:r>
+              <w:rPr>
+                <w:color w:val="0F172A"/>
+                <w:sz w:val="19"/>
+              </w:rPr>
+              <w:t>Provider rotation confirmed for cycles 3-4.</w:t>
+            </w:r>
+          </w:p>
+          <w:p>
+            <w:pPr>
+              <w:spacing w:after="40"/>
+            </w:pPr>
+            <w:r>
+              <w:rPr>
+                <w:b/>
+                <w:color w:val="555555"/>
+                <w:sz w:val="19"/>
+              </w:rPr>
+              <w:t xml:space="preserve">Notes: </w:t>
+            </w:r>
+            <w:r>
+              <w:rPr>
+                <w:i/>
+                <w:color w:val="555555"/>
+                <w:sz w:val="19"/>
+              </w:rPr>
+              <w:t>Grow the program only when the current load is sustainable.</w:t>
+            </w:r>
+          </w:p>
+        </w:tc>
+      </w:tr>
+    </w:tbl>
+    <w:tbl>
+      <w:tblPr>
+        <w:tblW w:type="auto" w:w="0"/>
+        <w:tblLayout w:type="fixed"/>
+        <w:tblLook w:firstColumn="1" w:firstRow="1" w:lastColumn="0" w:lastRow="0" w:noHBand="0" w:noVBand="1" w:val="04A0"/>
+      </w:tblPr>
+      <w:tblGrid>
+        <w:gridCol w:w="4986"/>
+        <w:gridCol w:w="4986"/>
+      </w:tblGrid>
+      <w:tr>
+        <w:tc>
+          <w:tcPr>
+            <w:tcW w:type="dxa" w:w="720"/>
+            <w:shd w:fill="0F6E6E"/>
+            <w:vAlign w:val="center"/>
+          </w:tcPr>
+          <w:p>
+            <w:pPr>
+              <w:jc w:val="center"/>
+            </w:pPr>
+            <w:r>
+              <w:rPr>
+                <w:b/>
+                <w:color w:val="FFFFFF"/>
+                <w:sz w:val="28"/>
+              </w:rPr>
+              <w:t>20</w:t>
+            </w:r>
+          </w:p>
+        </w:tc>
+        <w:tc>
+          <w:tcPr>
+            <w:tcW w:type="dxa" w:w="8496"/>
+            <w:vAlign w:val="center"/>
+          </w:tcPr>
+          <w:p>
+            <w:pPr>
+              <w:spacing w:after="40"/>
+            </w:pPr>
+            <w:r>
+              <w:rPr>
+                <w:b/>
+                <w:color w:val="0F172A"/>
+                <w:sz w:val="22"/>
+              </w:rPr>
+              <w:t>Update the KPI Tracker Monthly Data tab with your first 3 months of data: providers on rotation, charts audited, avg compliance %, HCCs recaptured, HEDIS gaps closed, etc.</w:t>
             </w:r>
           </w:p>
           <w:p>
@@ -2347,7 +2440,7 @@
                 <w:color w:val="FFFFFF"/>
                 <w:sz w:val="28"/>
               </w:rPr>
-              <w:t>20</w:t>
+              <w:t>21</w:t>
             </w:r>
           </w:p>
         </w:tc>
@@ -2419,7 +2512,7 @@
                 <w:color w:val="FFFFFF"/>
                 <w:sz w:val="28"/>
               </w:rPr>
-              <w:t>21</w:t>
+              <w:t>22</w:t>
             </w:r>
           </w:p>
         </w:tc>
@@ -2512,7 +2605,7 @@
                 <w:color w:val="FFFFFF"/>
                 <w:sz w:val="28"/>
               </w:rPr>
-              <w:t>22</w:t>
+              <w:t>23</w:t>
             </w:r>
           </w:p>
         </w:tc>
@@ -2605,7 +2698,7 @@
                 <w:color w:val="FFFFFF"/>
                 <w:sz w:val="28"/>
               </w:rPr>
-              <w:t>23</w:t>
+              <w:t>24</w:t>
             </w:r>
           </w:p>
         </w:tc>
@@ -2698,7 +2791,7 @@
                 <w:color w:val="FFFFFF"/>
                 <w:sz w:val="28"/>
               </w:rPr>
-              <w:t>24</w:t>
+              <w:t>25</w:t>
             </w:r>
           </w:p>
         </w:tc>
@@ -3294,7 +3387,7 @@
         <w:rPr>
           <w:sz w:val="21"/>
         </w:rPr>
-        <w:t>Payer portal access requested</w:t>
+        <w:t>Payer portal access requested · prior-year HCC lists pulled</w:t>
       </w:r>
     </w:p>
     <w:p>
@@ -3351,7 +3444,7 @@
         <w:rPr>
           <w:sz w:val="21"/>
         </w:rPr>
-        <w:t>30 charts audited on Claim tabs</w:t>
+        <w:t>30 charts audited on Claim tabs · HCC recapture logged in the same pass</w:t>
       </w:r>
     </w:p>
     <w:p>
@@ -3370,7 +3463,7 @@
         <w:rPr>
           <w:sz w:val="21"/>
         </w:rPr>
-        <w:t>3 provider scorecards sent</w:t>
+        <w:t>3 provider scorecards sent (documentation + HCC feedback combined)</w:t>
       </w:r>
     </w:p>
     <w:p>
@@ -3408,7 +3501,7 @@
         <w:rPr>
           <w:sz w:val="21"/>
         </w:rPr>
-        <w:t>Monthly SOP written</w:t>
+        <w:t>Monthly SOP written (audit + HCC as one integrated workflow)</w:t>
       </w:r>
     </w:p>
     <w:p>
@@ -3427,7 +3520,7 @@
         <w:rPr>
           <w:sz w:val="21"/>
         </w:rPr>
-        <w:t>Cycle 2 completed (60 total charts audited)</w:t>
+        <w:t>Cycle 2 completed (60 total charts audited · HCC log has 2 months of data)</w:t>
       </w:r>
     </w:p>
     <w:p>
@@ -3484,7 +3577,7 @@
         <w:rPr>
           <w:sz w:val="21"/>
         </w:rPr>
-        <w:t>MA HCC lists pulled from payer portal</w:t>
+        <w:t>Prior-year HCC lists refreshed for cycle 3</w:t>
       </w:r>
     </w:p>
     <w:p>
@@ -3503,26 +3596,7 @@
         <w:rPr>
           <w:sz w:val="21"/>
         </w:rPr>
-        <w:t>HCC recapture cross-check on cycle 3</w:t>
-      </w:r>
-    </w:p>
-    <w:p>
-      <w:pPr>
-        <w:spacing w:after="40"/>
-        <w:ind w:left="216"/>
-      </w:pPr>
-      <w:r>
-        <w:rPr>
-          <w:color w:val="0F6E6E"/>
-          <w:sz w:val="24"/>
-        </w:rPr>
-        <w:t xml:space="preserve">☐  </w:t>
-      </w:r>
-      <w:r>
-        <w:rPr>
-          <w:sz w:val="21"/>
-        </w:rPr>
-        <w:t>First HCC queries sent</w:t>
+        <w:t>Provider queries sent for suspect HCCs</w:t>
       </w:r>
     </w:p>
     <w:p>
@@ -3542,6 +3616,25 @@
           <w:sz w:val="21"/>
         </w:rPr>
         <w:t>HEDIS / CPT II gap review started (3 measures)</w:t>
+      </w:r>
+    </w:p>
+    <w:p>
+      <w:pPr>
+        <w:spacing w:after="40"/>
+        <w:ind w:left="216"/>
+      </w:pPr>
+      <w:r>
+        <w:rPr>
+          <w:color w:val="0F6E6E"/>
+          <w:sz w:val="24"/>
+        </w:rPr>
+        <w:t xml:space="preserve">☐  </w:t>
+      </w:r>
+      <w:r>
+        <w:rPr>
+          <w:sz w:val="21"/>
+        </w:rPr>
+        <w:t>Decision made on expanding provider rotation (3 vs 4-5)</w:t>
       </w:r>
     </w:p>
     <w:p>

</xml_diff>